<commit_message>
Update documentation links to use the master branch for example references
</commit_message>
<xml_diff>
--- a/examples/output/usage-document.docx
+++ b/examples/output/usage-document.docx
@@ -17,7 +17,61 @@
       </w:r>
     </w:p>
     <w:p>
-      <w:hyperlink r:id="rId3" w:history="1">
+      <w:r>
+        <w:t xml:space="preserve">Page </w:t>
+      </w:r>
+      <w:r>
+        <w:fldChar w:fldCharType="begin"/>
+      </w:r>
+      <w:r>
+        <w:instrText xml:space="preserve"> PAGE </w:instrText>
+      </w:r>
+      <w:r>
+        <w:fldChar w:fldCharType="separate"/>
+      </w:r>
+      <w:r>
+        <w:t>1</w:t>
+      </w:r>
+      <w:r>
+        <w:fldChar w:fldCharType="end"/>
+      </w:r>
+    </w:p>
+    <w:p>
+      <w:r>
+        <w:fldChar w:fldCharType="begin"/>
+      </w:r>
+      <w:r>
+        <w:instrText xml:space="preserve">TOC \o "1-3" \h \z \u</w:instrText>
+      </w:r>
+      <w:r>
+        <w:fldChar w:fldCharType="separate"/>
+      </w:r>
+      <w:r>
+        <w:fldChar w:fldCharType="end"/>
+      </w:r>
+    </w:p>
+    <w:p>
+      <w:r>
+        <w:t xml:space="preserve">Customer: </w:t>
+      </w:r>
+      <w:r>
+        <w:fldChar w:fldCharType="begin"/>
+      </w:r>
+      <w:r>
+        <w:instrText xml:space="preserve">MERGEFIELD CustomerName</w:instrText>
+      </w:r>
+      <w:r>
+        <w:fldChar w:fldCharType="separate"/>
+      </w:r>
+      <w:r>
+        <w:t>Acme Inc.</w:t>
+      </w:r>
+      <w:r>
+        <w:fldChar w:fldCharType="end"/>
+      </w:r>
+    </w:p>
+    <w:p>
+      <w:hyperlink r:id="rId4" w:history="1">
         <w:r>
           <w:rPr>
             <w:u w:val="single"/>
@@ -47,7 +101,7 @@
                     </pic:cNvPicPr>
                   </pic:nvPicPr>
                   <pic:blipFill>
-                    <a:blip r:embed="rId2"/>
+                    <a:blip r:embed="rId3"/>
                     <a:stretch>
                       <a:fillRect/>
                     </a:stretch>
@@ -126,9 +180,190 @@
       </w:tr>
     </w:tbl>
     <w:sectPr>
-      <w:pgSz w:w="12240" w:h="15840"/>
-      <w:pgMar w:top="1440" w:right="1440" w:bottom="1440" w:left="1440" w:header="720" w:footer="720"/>
+      <w:pgSz w:w="16838" w:h="11906" w:orient="landscape"/>
+      <w:pgMar w:top="720" w:right="720" w:bottom="720" w:left="720" w:header="720" w:footer="720"/>
+      <w:cols w:num="2" w:space="720"/>
+      <w:headerReference w:type="default" r:id="rId5"/>
+      <w:headerReference w:type="first" r:id="rId6"/>
+      <w:headerReference w:type="even" r:id="rId7"/>
+      <w:footerReference w:type="default" r:id="rId8"/>
+      <w:footerReference w:type="first" r:id="rId9"/>
+      <w:footerReference w:type="even" r:id="rId10"/>
     </w:sectPr>
   </w:body>
 </w:document>
+</file>
+
+<file path=word/footer1.xml><?xml version="1.0" encoding="utf-8"?>
+<w:ftr xmlns:w="http://schemas.openxmlformats.org/wordprocessingml/2006/main">
+  <w:p>
+    <w:r>
+      <w:t>Usage Sample Footer</w:t>
+    </w:r>
+  </w:p>
+</w:ftr>
+</file>
+
+<file path=word/footer2.xml><?xml version="1.0" encoding="utf-8"?>
+<w:ftr xmlns:w="http://schemas.openxmlformats.org/wordprocessingml/2006/main">
+  <w:p>
+    <w:r>
+      <w:t>Usage Sample First Page Footer</w:t>
+    </w:r>
+  </w:p>
+</w:ftr>
+</file>
+
+<file path=word/footer3.xml><?xml version="1.0" encoding="utf-8"?>
+<w:ftr xmlns:w="http://schemas.openxmlformats.org/wordprocessingml/2006/main">
+  <w:p>
+    <w:r>
+      <w:t>Usage Sample Even Page Footer</w:t>
+    </w:r>
+  </w:p>
+</w:ftr>
+</file>
+
+<file path=word/header1.xml><?xml version="1.0" encoding="utf-8"?>
+<w:hdr xmlns:w="http://schemas.openxmlformats.org/wordprocessingml/2006/main">
+  <w:p>
+    <w:r>
+      <w:t>Usage Sample Header</w:t>
+    </w:r>
+  </w:p>
+</w:hdr>
+</file>
+
+<file path=word/header2.xml><?xml version="1.0" encoding="utf-8"?>
+<w:hdr xmlns:w="http://schemas.openxmlformats.org/wordprocessingml/2006/main">
+  <w:p>
+    <w:r>
+      <w:t>Usage Sample First Page Header</w:t>
+    </w:r>
+  </w:p>
+</w:hdr>
+</file>
+
+<file path=word/header3.xml><?xml version="1.0" encoding="utf-8"?>
+<w:hdr xmlns:w="http://schemas.openxmlformats.org/wordprocessingml/2006/main">
+  <w:p>
+    <w:r>
+      <w:t>Usage Sample Even Page Header</w:t>
+    </w:r>
+  </w:p>
+</w:hdr>
+</file>
+
+<file path=word/styles.xml><?xml version="1.0" encoding="utf-8"?>
+<w:styles xmlns:w="http://schemas.openxmlformats.org/wordprocessingml/2006/main" xmlns:r="http://schemas.openxmlformats.org/officeDocument/2006/relationships">
+  <w:docDefaults>
+    <w:rPrDefault>
+      <w:rPr>
+        <w:sz w:val="22"/>
+        <w:szCs w:val="22"/>
+      </w:rPr>
+    </w:rPrDefault>
+    <w:pPrDefault>
+      <w:pPr>
+        <w:spacing w:after="200" w:line="276" w:lineRule="auto"/>
+      </w:pPr>
+    </w:pPrDefault>
+  </w:docDefaults>
+  <w:latentStyles w:defLockedState="0" w:defUIPriority="99" w:defSemiHidden="1" w:defUnhideWhenUsed="1" w:defQFormat="0" w:count="267">
+    <w:lsdException w:name="Normal" w:semiHidden="0" w:uiPriority="0" w:unhideWhenUsed="0" w:qFormat="1"/>
+    <w:lsdException w:name="heading 1" w:semiHidden="0" w:uiPriority="9" w:unhideWhenUsed="0" w:qFormat="1"/>
+    <w:lsdException w:name="heading 2" w:uiPriority="9" w:qFormat="1"/>
+    <w:lsdException w:name="heading 3" w:uiPriority="9" w:qFormat="1"/>
+    <w:lsdException w:name="heading 4" w:uiPriority="9"/>
+    <w:lsdException w:name="heading 5" w:uiPriority="9"/>
+    <w:lsdException w:name="heading 6" w:uiPriority="9"/>
+    <w:lsdException w:name="heading 7" w:uiPriority="9"/>
+    <w:lsdException w:name="heading 8" w:uiPriority="9"/>
+    <w:lsdException w:name="heading 9" w:uiPriority="9"/>
+    <w:lsdException w:name="Title" w:semiHidden="0" w:uiPriority="10"/>
+    <w:lsdException w:name="Subtitle" w:semiHidden="0" w:uiPriority="11"/>
+    <w:lsdException w:name="Strong" w:uiPriority="22" w:qFormat="1"/>
+    <w:lsdException w:name="Emphasis" w:uiPriority="20" w:qFormat="1"/>
+    <w:lsdException w:name="No Spacing" w:semiHidden="0" w:uiPriority="1" w:qFormat="1"/>
+    <w:lsdException w:name="List Paragraph" w:uiPriority="34" w:qFormat="1"/>
+    <w:lsdException w:name="Quote" w:uiPriority="29" w:qFormat="1"/>
+    <w:lsdException w:name="Intense Quote" w:uiPriority="30" w:qFormat="1"/>
+    <w:lsdException w:name="Subtle Emphasis" w:uiPriority="19" w:qFormat="1"/>
+    <w:lsdException w:name="Intense Emphasis" w:uiPriority="21" w:qFormat="1"/>
+    <w:lsdException w:name="Subtle Reference" w:uiPriority="31" w:qFormat="1"/>
+    <w:lsdException w:name="Intense Reference" w:uiPriority="32" w:qFormat="1"/>
+  </w:latentStyles>
+  <w:style w:type="paragraph" w:styleId="Normal" w:default="1">
+    <w:name w:val="Normal"/>
+    <w:qFormat/>
+    <w:uiPriority w:val="0"/>
+    <w:semiHidden w:val="0"/>
+    <w:unhideWhenUsed w:val="0"/>
+    <w:rPr>
+      <w:sz w:val="24"/>
+      <w:szCs w:val="24"/>
+    </w:rPr>
+    <w:pPr>
+      <w:spacing w:after="0" w:line="240" w:lineRule="auto"/>
+    </w:pPr>
+  </w:style>
+  <w:style w:type="paragraph" w:styleId="heading 1">
+    <w:name w:val="Heading 1"/>
+    <w:basedOn w:val="Normal"/>
+    <w:next w:val="Normal"/>
+    <w:qFormat/>
+    <w:uiPriority w:val="9"/>
+    <w:rPr>
+      <w:b w:val="on"/>
+      <w:color w:val="2F5496" w:themeColor="accent1" w:themeShade="BF"/>
+      <w:sz w:val="32"/>
+      <w:szCs w:val="32"/>
+      <w:kern w:val="0"/>
+      <w:spacing w:val="0" w:csVal="0"/>
+    </w:rPr>
+    <w:pPr>
+      <w:spacing w:before="480" w:after="0"/>
+      <w:outlineLvl w:val="0"/>
+    </w:pPr>
+  </w:style>
+  <w:style w:type="paragraph" w:styleId="heading 2">
+    <w:name w:val="Heading 2"/>
+    <w:basedOn w:val="Normal"/>
+    <w:next w:val="Normal"/>
+    <w:qFormat/>
+    <w:uiPriority w:val="9"/>
+    <w:rPr>
+      <w:b w:val="on"/>
+      <w:i w:val="on"/>
+      <w:color w:val="2F5496" w:themeColor="accent1" w:themeShade="BF"/>
+      <w:sz w:val="28"/>
+      <w:szCs w:val="28"/>
+      <w:kern w:val="0"/>
+      <w:spacing w:val="0" w:csVal="0"/>
+    </w:rPr>
+    <w:pPr>
+      <w:spacing w:before="280" w:after="0"/>
+      <w:outlineLvl w:val="1"/>
+    </w:pPr>
+  </w:style>
+  <w:style w:type="paragraph" w:styleId="heading 3">
+    <w:name w:val="Heading 3"/>
+    <w:basedOn w:val="Normal"/>
+    <w:next w:val="Normal"/>
+    <w:qFormat/>
+    <w:uiPriority w:val="9"/>
+    <w:rPr>
+      <w:b w:val="on"/>
+      <w:color w:val="1F3864" w:themeColor="accent1" w:themeDark="25"/>
+      <w:sz w:val="24"/>
+      <w:szCs w:val="24"/>
+      <w:kern w:val="0"/>
+      <w:spacing w:val="0" w:csVal="0"/>
+    </w:rPr>
+    <w:pPr>
+      <w:spacing w:before="200" w:after="0"/>
+      <w:outlineLvl w:val="2"/>
+    </w:pPr>
+  </w:style>
+</w:styles>
 </file>
</xml_diff>